<commit_message>
ci: configure GitHub Actions CI/CD
</commit_message>
<xml_diff>
--- a/bot/output/1555793414/Договор_прием_Кенжаев_Бахром_Хуррамович.docx
+++ b/bot/output/1555793414/Договор_прием_Кенжаев_Бахром_Хуррамович.docx
@@ -194,7 +194,7 @@
         </w:rPr>
       </w:pPr>
       <w:r>
-        <w:t xml:space="preserve">Индивидуальный предприниматель Глава крестьянского (фермерского) хозяйства Генералов Александр Валериевич, действующий на основании. ОГРН 319302500024366, ИНН 312009347140, именуемый в дальнейшем «Заказчик» и гражданин Узбекистан Кенжаев Бахром Хуррамович, 26.01.1984 года рождения, паспорт серия FA №1874962 выдан 20.01.2021г. МВД 22232, зарегистрированный по адресу: , именуемый в дальнейшем «Подрядчик» (далее «Стороны»), заключили настоящий договор о нижеследующем:</w:t>
+        <w:t xml:space="preserve">Индивидуальный предприниматель Глава крестьянского (фермерского) хозяйства Генералов Александр Валериевич, действующий на основании. ОГРН 319302500024366, ИНН 312009347140, именуемый в дальнейшем «Заказчик» и гражданин УЗБЕКИСТАН КЕНЖАЕВ БАХРОМ ХУРРАМОВИЧ, 26.01.1984 года рождения, паспорт серия FA №1874962 выдан 20.01.2021г. МВД 22232, зарегистрированный по адресу: , именуемый в дальнейшем «Подрядчик» (далее «Стороны»), заключили настоящий договор о нижеследующем:</w:t>
       </w:r>
     </w:p>
     <w:p>
@@ -1855,7 +1855,7 @@
               </w:rPr>
             </w:pPr>
             <w:r>
-              <w:t xml:space="preserve">Гражданин Узбекистан</w:t>
+              <w:t xml:space="preserve">Гражданин УЗБЕКИСТАН</w:t>
             </w:r>
           </w:p>
           <w:p>
@@ -1868,7 +1868,7 @@
               </w:rPr>
             </w:pPr>
             <w:r>
-              <w:t xml:space="preserve">Кенжаев Бахром Хуррамович, 26.01.1984 года рождения, паспорт серия FA № 1874962 выдан 20.01.2021г. МВД 22232, зарегистрированный по адресу: , </w:t>
+              <w:t xml:space="preserve">КЕНЖАЕВ БАХРОМ ХУРРАМОВИЧ, 26.01.1984 года рождения, паспорт серия FA № 1874962 выдан 20.01.2021г. МВД 22232, зарегистрированный по адресу: , </w:t>
             </w:r>
           </w:p>
           <w:p>

</xml_diff>